<commit_message>
Apply all 120 strategic suggestions to 12 documents (381K total words)
120 suggestions implemented across all 12 docs (40 per agent batch):
- Docs 1-4: 50 new sections (market indictment, B pathway, acquirers,
  failure story, before/after cards, alumni guarantee, flywheel math,
  Creator Economy Index, Discord community, 30-day sprint)
- Docs 5-8: 40 new sections (Shadow Deal, reluctant creator, audience
  draft, poison pick, Glassdoor concept, AI accuracy study, boost mechanic)
- Docs 9-12: 40 new sections + Top 10 Master List (SaaS reframe, sizzle
  restructure, format IP protection, brand CMO case study, SXSW plan,
  failure recovery protocols, decision framework)

All marked with [NEW] prefix for easy identification.
324K → 381K words (+57K from suggestions).

Co-Authored-By: Claude Opus 4.6 (1M context) <noreply@anthropic.com>
</commit_message>
<xml_diff>
--- a/docs/ADDITIONAL_YOUTUBE_PODCAST_CONCEPTS.docx
+++ b/docs/ADDITIONAL_YOUTUBE_PODCAST_CONCEPTS.docx
@@ -17534,10 +17534,10 @@
         <w:tblLook w:firstRow="1" w:lastRow="0" w:firstColumn="0" w:lastColumn="0" w:noHBand="0" w:noVBand="0" w:val="0020"/>
       </w:tblPr>
       <w:tblGrid>
-        <w:gridCol w:w="2160"/>
-        <w:gridCol w:w="1152"/>
-        <w:gridCol w:w="2448"/>
-        <w:gridCol w:w="2160"/>
+        <w:gridCol w:w="2212"/>
+        <w:gridCol w:w="1630"/>
+        <w:gridCol w:w="1630"/>
+        <w:gridCol w:w="2445"/>
       </w:tblGrid>
       <w:tr>
         <w:trPr>
@@ -18202,10 +18202,10 @@
         <w:tblLook w:firstRow="1" w:lastRow="0" w:firstColumn="0" w:lastColumn="0" w:noHBand="0" w:noVBand="0" w:val="0020"/>
       </w:tblPr>
       <w:tblGrid>
-        <w:gridCol w:w="1342"/>
-        <w:gridCol w:w="2818"/>
-        <w:gridCol w:w="2818"/>
-        <w:gridCol w:w="939"/>
+        <w:gridCol w:w="2892"/>
+        <w:gridCol w:w="1377"/>
+        <w:gridCol w:w="1446"/>
+        <w:gridCol w:w="2203"/>
       </w:tblGrid>
       <w:tr>
         <w:trPr>
@@ -18886,10 +18886,10 @@
         <w:tblLook w:firstRow="1" w:lastRow="0" w:firstColumn="0" w:lastColumn="0" w:noHBand="0" w:noVBand="0" w:val="0020"/>
       </w:tblPr>
       <w:tblGrid>
-        <w:gridCol w:w="1782"/>
-        <w:gridCol w:w="1386"/>
-        <w:gridCol w:w="3960"/>
-        <w:gridCol w:w="792"/>
+        <w:gridCol w:w="220"/>
+        <w:gridCol w:w="691"/>
+        <w:gridCol w:w="1257"/>
+        <w:gridCol w:w="5751"/>
       </w:tblGrid>
       <w:tr>
         <w:trPr>
@@ -19594,20 +19594,2326 @@
         </w:rPr>
         <w:t xml:space="preserve">Review completed: 2026-03-20</w:t>
       </w:r>
-      <w:r>
-        <w:t xml:space="preserve"> </w:t>
-      </w:r>
-      <w:r>
-        <w:rPr>
-          <w:i/>
-          <w:iCs/>
-        </w:rPr>
-        <w:t xml:space="preserve">Three prior documents reviewed and updated in this audit: PART2_TV_SHOW_COMPLETE.md (Grade B+), PART2_TV_SHOW_ADDITIONAL_CONCEPTS.md (Grade A-), PART3_4_5_VIRAL_PODCAST_THESIS_COMPLETE.md (Grade A-)</w:t>
+    </w:p>
+    <w:p>
+      <w:r>
+        <w:pict>
+          <v:rect style="width:0;height:1.5pt" o:hralign="center" o:hrstd="t" o:hr="t"/>
+        </w:pict>
       </w:r>
     </w:p>
     <w:bookmarkEnd w:id="147"/>
     <w:bookmarkEnd w:id="148"/>
     <w:bookmarkEnd w:id="149"/>
+    <w:bookmarkStart w:id="188" w:name="X9f1a4e6e344b18d043f5dd54baa5a43cbcab2b5"/>
+    <w:p>
+      <w:pPr>
+        <w:pStyle w:val="Heading1"/>
+      </w:pPr>
+      <w:r>
+        <w:t xml:space="preserve">[NEW] STRATEGIC ENHANCEMENTS — APPLIED FROM EXECUTIVE REVIEW</w:t>
+      </w:r>
+    </w:p>
+    <w:p>
+      <w:pPr>
+        <w:pStyle w:val="FirstParagraph"/>
+      </w:pPr>
+      <w:r>
+        <w:rPr>
+          <w:i/>
+          <w:iCs/>
+        </w:rPr>
+        <w:t xml:space="preserve">The following sections apply all 10 suggestions from the Senior Entertainment Executive Review (March 20, 2026). Each section addresses a specific recommendation for the additional YouTube concepts (The Brand Side, Deal or No Deal: Small Creator Edition) and the additional podcast concepts (The Negotiation, Creator Confessions, Rate My Deal), plus the broader platform intelligence strategy.</w:t>
+      </w:r>
+    </w:p>
+    <w:p>
+      <w:r>
+        <w:pict>
+          <v:rect style="width:0;height:1.5pt" o:hralign="center" o:hrstd="t" o:hr="t"/>
+        </w:pict>
+      </w:r>
+    </w:p>
+    <w:bookmarkStart w:id="153" w:name="X302771a4ea6962082cef4c261056ce5fcecc405"/>
+    <w:p>
+      <w:pPr>
+        <w:pStyle w:val="Heading2"/>
+      </w:pPr>
+      <w:r>
+        <w:t xml:space="preserve">[NEW] 8.1 — Rate My Deal Becomes Glassdoor: Building the Creator Economy’s First Open Compensation Database</w:t>
+      </w:r>
+    </w:p>
+    <w:bookmarkStart w:id="150" w:name="concept-overview"/>
+    <w:p>
+      <w:pPr>
+        <w:pStyle w:val="Heading3"/>
+      </w:pPr>
+      <w:r>
+        <w:t xml:space="preserve">Concept Overview</w:t>
+      </w:r>
+    </w:p>
+    <w:p>
+      <w:pPr>
+        <w:pStyle w:val="FirstParagraph"/>
+      </w:pPr>
+      <w:r>
+        <w:t xml:space="preserve">Every deal rated on Rate My Deal becomes a permanent, publicly searchable entry in a DealStage database called</w:t>
+      </w:r>
+      <w:r>
+        <w:t xml:space="preserve"> </w:t>
+      </w:r>
+      <w:r>
+        <w:t xml:space="preserve">“Deal Reference”</w:t>
+      </w:r>
+      <w:r>
+        <w:t xml:space="preserve"> </w:t>
+      </w:r>
+      <w:r>
+        <w:t xml:space="preserve">— an open, anonymized repository of real, expert-reviewed deal benchmarks that functions as the creator economy’s first compensation reference. The show generates the expert commentary; the database transforms that commentary into a permanent platform asset that compounds in value with every episode produced.</w:t>
+      </w:r>
+    </w:p>
+    <w:bookmarkEnd w:id="150"/>
+    <w:bookmarkStart w:id="151" w:name="X9a2dd586ed6e375825017ba5a3f95fa4726da3e"/>
+    <w:p>
+      <w:pPr>
+        <w:pStyle w:val="Heading3"/>
+      </w:pPr>
+      <w:r>
+        <w:t xml:space="preserve">The Glassdoor Precedent and What It Means for DealStage</w:t>
+      </w:r>
+    </w:p>
+    <w:p>
+      <w:pPr>
+        <w:pStyle w:val="FirstParagraph"/>
+      </w:pPr>
+      <w:r>
+        <w:t xml:space="preserve">Glassdoor became a $1.2 billion company by doing one thing: making compensation data searchable when it was previously secret. In 2008, employment compensation was negotiated in information vacuums — job seekers had no reliable reference for what similar roles paid at similar companies. Glassdoor built its entire value proposition on closing that information asymmetry.</w:t>
+      </w:r>
+    </w:p>
+    <w:p>
+      <w:pPr>
+        <w:pStyle w:val="BodyText"/>
+      </w:pPr>
+      <w:r>
+        <w:t xml:space="preserve">The creator economy’s compensation data is in the same pre-transparency moment that employment compensation was in 2008. Every creator is negotiating blind. Every brand is making offers without knowing whether their rates are competitive or exploitative. Rate My Deal generates the expert analysis that converts individual deal reviews into market intelligence. The Deal Reference database makes that intelligence searchable, permanent, and compounding.</w:t>
+      </w:r>
+    </w:p>
+    <w:bookmarkEnd w:id="151"/>
+    <w:bookmarkStart w:id="152" w:name="implementation-blueprint"/>
+    <w:p>
+      <w:pPr>
+        <w:pStyle w:val="Heading3"/>
+      </w:pPr>
+      <w:r>
+        <w:t xml:space="preserve">Implementation Blueprint</w:t>
+      </w:r>
+    </w:p>
+    <w:p>
+      <w:pPr>
+        <w:pStyle w:val="FirstParagraph"/>
+      </w:pPr>
+      <w:r>
+        <w:rPr>
+          <w:b/>
+          <w:bCs/>
+        </w:rPr>
+        <w:t xml:space="preserve">Database Integration:</w:t>
+      </w:r>
+      <w:r>
+        <w:t xml:space="preserve"> </w:t>
+      </w:r>
+      <w:r>
+        <w:t xml:space="preserve">Build Deal Reference as a searchable feature within DealStage, structured with the following data fields for each entry: creator content category, primary platform, follower range at time of deal, deal type (sponsored post, ambassador, affiliate, licensing), deal structure (flat fee, commission, equity, hybrid), total compensation, and the panel’s rating (Fair, Underpaid by X%, Overpaid by X%).</w:t>
+      </w:r>
+    </w:p>
+    <w:p>
+      <w:pPr>
+        <w:pStyle w:val="BodyText"/>
+      </w:pPr>
+      <w:r>
+        <w:rPr>
+          <w:b/>
+          <w:bCs/>
+        </w:rPr>
+        <w:t xml:space="preserve">Free Access Model:</w:t>
+      </w:r>
+      <w:r>
+        <w:t xml:space="preserve"> </w:t>
+      </w:r>
+      <w:r>
+        <w:t xml:space="preserve">Make Deal Reference accessible with a free DealStage account. The database is the platform’s primary acquisition hook for creators who need deal benchmarks but are not yet ready to pay for full platform access. Creators find Deal Reference through organic search; they sign up for free access; a percentage converts to paid subscribers as their deal volume grows.</w:t>
+      </w:r>
+    </w:p>
+    <w:p>
+      <w:pPr>
+        <w:pStyle w:val="BodyText"/>
+      </w:pPr>
+      <w:r>
+        <w:rPr>
+          <w:b/>
+          <w:bCs/>
+        </w:rPr>
+        <w:t xml:space="preserve">Anonymization Protocol:</w:t>
+      </w:r>
+      <w:r>
+        <w:t xml:space="preserve"> </w:t>
+      </w:r>
+      <w:r>
+        <w:t xml:space="preserve">Anonymize all creator-specific identifying information while preserving the data’s commercial utility. The benchmark is the deal structure, not the identity. This also protects the show from legal exposure related to publicly identifying specific deal terms.</w:t>
+      </w:r>
+    </w:p>
+    <w:p>
+      <w:pPr>
+        <w:pStyle w:val="BodyText"/>
+      </w:pPr>
+      <w:r>
+        <w:rPr>
+          <w:b/>
+          <w:bCs/>
+        </w:rPr>
+        <w:t xml:space="preserve">The State of Creator Compensation Report:</w:t>
+      </w:r>
+      <w:r>
+        <w:t xml:space="preserve"> </w:t>
+      </w:r>
+      <w:r>
+        <w:t xml:space="preserve">After 6 months of Rate My Deal episodes, publish a</w:t>
+      </w:r>
+      <w:r>
+        <w:t xml:space="preserve"> </w:t>
+      </w:r>
+      <w:r>
+        <w:t xml:space="preserve">“State of Creator Compensation”</w:t>
+      </w:r>
+      <w:r>
+        <w:t xml:space="preserve"> </w:t>
+      </w:r>
+      <w:r>
+        <w:t xml:space="preserve">report using the Deal Reference database as the primary data source. This report becomes the most-cited document in the creator economy — covering the question every journalist, researcher, and creator advocate wants answered — and drives press coverage that no advertising budget can manufacture.</w:t>
+      </w:r>
+    </w:p>
+    <w:p>
+      <w:pPr>
+        <w:pStyle w:val="BodyText"/>
+      </w:pPr>
+      <w:r>
+        <w:rPr>
+          <w:b/>
+          <w:bCs/>
+        </w:rPr>
+        <w:t xml:space="preserve">B2B Revenue Layer:</w:t>
+      </w:r>
+      <w:r>
+        <w:t xml:space="preserve"> </w:t>
+      </w:r>
+      <w:r>
+        <w:t xml:space="preserve">In Year 2, charge brand-side subscribers for access to advanced Deal Reference analytics: rate trend data by category over time, platform-specific benchmark comparisons, exclusivity clause frequency analysis by brand category, and deal structure evolution data. This creates a B2B data revenue stream layered on top of the free creator-side resource — the same model that Glassdoor used to monetize employer-side access to its compensation data.</w:t>
+      </w:r>
+    </w:p>
+    <w:p>
+      <w:pPr>
+        <w:pStyle w:val="BodyText"/>
+      </w:pPr>
+      <w:r>
+        <w:rPr>
+          <w:b/>
+          <w:bCs/>
+        </w:rPr>
+        <w:t xml:space="preserve">Impact Rating:</w:t>
+      </w:r>
+      <w:r>
+        <w:t xml:space="preserve"> </w:t>
+      </w:r>
+      <w:r>
+        <w:t xml:space="preserve">High |</w:t>
+      </w:r>
+      <w:r>
+        <w:t xml:space="preserve"> </w:t>
+      </w:r>
+      <w:r>
+        <w:rPr>
+          <w:b/>
+          <w:bCs/>
+        </w:rPr>
+        <w:t xml:space="preserve">Effort Rating:</w:t>
+      </w:r>
+      <w:r>
+        <w:t xml:space="preserve"> </w:t>
+      </w:r>
+      <w:r>
+        <w:t xml:space="preserve">Medium</w:t>
+      </w:r>
+    </w:p>
+    <w:p>
+      <w:r>
+        <w:pict>
+          <v:rect style="width:0;height:1.5pt" o:hralign="center" o:hrstd="t" o:hr="t"/>
+        </w:pict>
+      </w:r>
+    </w:p>
+    <w:bookmarkEnd w:id="152"/>
+    <w:bookmarkEnd w:id="153"/>
+    <w:bookmarkStart w:id="157" w:name="X076aa1e5fd544f75027d8b66d6280fcb14de6d5"/>
+    <w:p>
+      <w:pPr>
+        <w:pStyle w:val="Heading2"/>
+      </w:pPr>
+      <w:r>
+        <w:t xml:space="preserve">[NEW] 8.2 — The Rejection-to-Acceptance Arc: Casting</w:t>
+      </w:r>
+      <w:r>
+        <w:t xml:space="preserve"> </w:t>
+      </w:r>
+      <w:r>
+        <w:t xml:space="preserve">“First Deal”</w:t>
+      </w:r>
+      <w:r>
+        <w:t xml:space="preserve"> </w:t>
+      </w:r>
+      <w:r>
+        <w:t xml:space="preserve">Around a Brand That Previously Refused</w:t>
+      </w:r>
+    </w:p>
+    <w:bookmarkStart w:id="154" w:name="concept-overview-1"/>
+    <w:p>
+      <w:pPr>
+        <w:pStyle w:val="Heading3"/>
+      </w:pPr>
+      <w:r>
+        <w:t xml:space="preserve">Concept Overview</w:t>
+      </w:r>
+    </w:p>
+    <w:p>
+      <w:pPr>
+        <w:pStyle w:val="FirstParagraph"/>
+      </w:pPr>
+      <w:r>
+        <w:t xml:space="preserve">In the First Deal documentary series, specifically cast one creator whose first brand deal is with a brand that previously rejected or ghosted them. Film both the historical rejection — through recreated correspondence, interviews, and contemporary social posts — and the eventual acceptance using DealStage’s AI match score as the narrative turning point. The AI match score is not just the tool that closes the deal; it is the mechanism of the creator’s vindication.</w:t>
+      </w:r>
+    </w:p>
+    <w:bookmarkEnd w:id="154"/>
+    <w:bookmarkStart w:id="155" w:name="Xa5dc1467e7d7e3607a44d33137d94c781e7b40c"/>
+    <w:p>
+      <w:pPr>
+        <w:pStyle w:val="Heading3"/>
+      </w:pPr>
+      <w:r>
+        <w:t xml:space="preserve">Why the Revenge Narrative Is the Most Shareable Content Structure in Social Media</w:t>
+      </w:r>
+    </w:p>
+    <w:p>
+      <w:pPr>
+        <w:pStyle w:val="FirstParagraph"/>
+      </w:pPr>
+      <w:r>
+        <w:t xml:space="preserve">The revenge narrative is one of the most emotionally satisfying arcs in storytelling.</w:t>
+      </w:r>
+      <w:r>
+        <w:t xml:space="preserve"> </w:t>
+      </w:r>
+      <w:r>
+        <w:t xml:space="preserve">“She applied to Sephora three times. They never responded. Then DealStage matched her at 94% and the same brand came to her.”</w:t>
+      </w:r>
+      <w:r>
+        <w:t xml:space="preserve"> </w:t>
+      </w:r>
+      <w:r>
+        <w:t xml:space="preserve">That is a trailer. That is a tweet thread that goes viral. That is the kind of before-and-after transformation story that converts viewers to platform users at rates that tutorial content cannot approach.</w:t>
+      </w:r>
+    </w:p>
+    <w:p>
+      <w:pPr>
+        <w:pStyle w:val="BodyText"/>
+      </w:pPr>
+      <w:r>
+        <w:t xml:space="preserve">It also makes the AI protagonist in a story that would otherwise be purely human. The AI is not just a tool the creator used — it is the system that saw the fit that the brand’s human reviewers missed. That framing has implications beyond the single episode: it positions DealStage’s AI as something worth trusting over human judgment, which is the platform’s central commercial claim.</w:t>
+      </w:r>
+    </w:p>
+    <w:bookmarkEnd w:id="155"/>
+    <w:bookmarkStart w:id="156" w:name="implementation-blueprint-1"/>
+    <w:p>
+      <w:pPr>
+        <w:pStyle w:val="Heading3"/>
+      </w:pPr>
+      <w:r>
+        <w:t xml:space="preserve">Implementation Blueprint</w:t>
+      </w:r>
+    </w:p>
+    <w:p>
+      <w:pPr>
+        <w:pStyle w:val="FirstParagraph"/>
+      </w:pPr>
+      <w:r>
+        <w:rPr>
+          <w:b/>
+          <w:bCs/>
+        </w:rPr>
+        <w:t xml:space="preserve">The Casting Filter:</w:t>
+      </w:r>
+      <w:r>
+        <w:t xml:space="preserve"> </w:t>
+      </w:r>
+      <w:r>
+        <w:t xml:space="preserve">During casting for First Deal, include an explicit question in every application:</w:t>
+      </w:r>
+      <w:r>
+        <w:t xml:space="preserve"> </w:t>
+      </w:r>
+      <w:r>
+        <w:t xml:space="preserve">“Has a brand you wanted to work with ever rejected or ignored your pitch?”</w:t>
+      </w:r>
+      <w:r>
+        <w:t xml:space="preserve"> </w:t>
+      </w:r>
+      <w:r>
+        <w:t xml:space="preserve">Make this question a primary casting filter rather than an afterthought. The rejection story is the episode — find it before committing to a creator.</w:t>
+      </w:r>
+    </w:p>
+    <w:p>
+      <w:pPr>
+        <w:pStyle w:val="BodyText"/>
+      </w:pPr>
+      <w:r>
+        <w:rPr>
+          <w:b/>
+          <w:bCs/>
+        </w:rPr>
+        <w:t xml:space="preserve">Brand Research:</w:t>
+      </w:r>
+      <w:r>
+        <w:t xml:space="preserve"> </w:t>
+      </w:r>
+      <w:r>
+        <w:t xml:space="preserve">For creators with compelling rejection stories, research whether the rejecting brand maintains an active creator economy presence and whether they are a DealStage platform participant or a realistic prospect for platform participation. If the original brand is unreachable, document their rejection and use a comparable competitor brand for the acceptance arc — the AI’s match score still demonstrates the creator was always qualified.</w:t>
+      </w:r>
+    </w:p>
+    <w:p>
+      <w:pPr>
+        <w:pStyle w:val="BodyText"/>
+      </w:pPr>
+      <w:r>
+        <w:rPr>
+          <w:b/>
+          <w:bCs/>
+        </w:rPr>
+        <w:t xml:space="preserve">Episode Structure:</w:t>
+      </w:r>
+      <w:r>
+        <w:t xml:space="preserve"> </w:t>
+      </w:r>
+      <w:r>
+        <w:t xml:space="preserve">5 minutes on the original rejection (recreated via documented correspondence, interview footage, and contemporaneous social posts from the time), 5 minutes on what the creator did in the years between rejection and DealStage, 5 minutes on the DealStage match score and what it revealed about the creator’s actual market value, and the final sequence on whether the brand accepts.</w:t>
+      </w:r>
+    </w:p>
+    <w:p>
+      <w:pPr>
+        <w:pStyle w:val="BodyText"/>
+      </w:pPr>
+      <w:r>
+        <w:rPr>
+          <w:b/>
+          <w:bCs/>
+        </w:rPr>
+        <w:t xml:space="preserve">Pilot Placement:</w:t>
+      </w:r>
+      <w:r>
+        <w:t xml:space="preserve"> </w:t>
+      </w:r>
+      <w:r>
+        <w:t xml:space="preserve">Release the rejection-to-acceptance episode as the series pilot. It is the highest-emotional-stakes entry point into the First Deal format and generates the word-of-mouth and press coverage that drives discovery of subsequent episodes.</w:t>
+      </w:r>
+    </w:p>
+    <w:p>
+      <w:pPr>
+        <w:pStyle w:val="BodyText"/>
+      </w:pPr>
+      <w:r>
+        <w:rPr>
+          <w:b/>
+          <w:bCs/>
+        </w:rPr>
+        <w:t xml:space="preserve">Impact Rating:</w:t>
+      </w:r>
+      <w:r>
+        <w:t xml:space="preserve"> </w:t>
+      </w:r>
+      <w:r>
+        <w:t xml:space="preserve">High |</w:t>
+      </w:r>
+      <w:r>
+        <w:t xml:space="preserve"> </w:t>
+      </w:r>
+      <w:r>
+        <w:rPr>
+          <w:b/>
+          <w:bCs/>
+        </w:rPr>
+        <w:t xml:space="preserve">Effort Rating:</w:t>
+      </w:r>
+      <w:r>
+        <w:t xml:space="preserve"> </w:t>
+      </w:r>
+      <w:r>
+        <w:t xml:space="preserve">Low</w:t>
+      </w:r>
+    </w:p>
+    <w:p>
+      <w:r>
+        <w:pict>
+          <v:rect style="width:0;height:1.5pt" o:hralign="center" o:hrstd="t" o:hr="t"/>
+        </w:pict>
+      </w:r>
+    </w:p>
+    <w:bookmarkEnd w:id="156"/>
+    <w:bookmarkEnd w:id="157"/>
+    <w:bookmarkStart w:id="161" w:name="X7a4cbc4d2d2cc4197c8ecf237c9e59eac1ec66e"/>
+    <w:p>
+      <w:pPr>
+        <w:pStyle w:val="Heading2"/>
+      </w:pPr>
+      <w:r>
+        <w:t xml:space="preserve">[NEW] 8.3 — The Negotiation as a Live Conference Performance: Filming Audience Reaction as the Emotional Layer</w:t>
+      </w:r>
+    </w:p>
+    <w:bookmarkStart w:id="158" w:name="concept-overview-2"/>
+    <w:p>
+      <w:pPr>
+        <w:pStyle w:val="Heading3"/>
+      </w:pPr>
+      <w:r>
+        <w:t xml:space="preserve">Concept Overview</w:t>
+      </w:r>
+    </w:p>
+    <w:p>
+      <w:pPr>
+        <w:pStyle w:val="FirstParagraph"/>
+      </w:pPr>
+      <w:r>
+        <w:t xml:space="preserve">Produce two to four episodes of The Negotiation per year as live performances at creator economy conferences — VidCon, Creator Summit, Playlist Live — where the negotiation breakdown is narrated live on stage and the audience of creators reacts in real time. Film the audience reaction as the episode’s emotional layer. The creator economy conference audience is DealStage’s most concentrated prospect pool anywhere in the world; the live performance delivers the podcast’s value proposition directly to that audience in a format that generates social media content, press coverage, and DealStage brand awareness simultaneously.</w:t>
+      </w:r>
+    </w:p>
+    <w:bookmarkEnd w:id="158"/>
+    <w:bookmarkStart w:id="159" w:name="the-live-podcast-precedent"/>
+    <w:p>
+      <w:pPr>
+        <w:pStyle w:val="Heading3"/>
+      </w:pPr>
+      <w:r>
+        <w:t xml:space="preserve">The Live Podcast Precedent</w:t>
+      </w:r>
+    </w:p>
+    <w:p>
+      <w:pPr>
+        <w:pStyle w:val="FirstParagraph"/>
+      </w:pPr>
+      <w:r>
+        <w:t xml:space="preserve">The most successful podcast-to-live-event transitions of the past decade discovered the same thing: the audience’s emotional experience of a story they have listened to privately is qualitatively different when shared with 2,000 other people who have had the same experience. The Negotiation deals with situations every creator in that conference room has personally lived through. The audience’s visceral reaction — gasping at a missed negotiation opportunity, laughing at a brand’s absurd low-ball offer, going silent when a deal collapses — creates social content in real time.</w:t>
+      </w:r>
+    </w:p>
+    <w:bookmarkEnd w:id="159"/>
+    <w:bookmarkStart w:id="160" w:name="implementation-blueprint-2"/>
+    <w:p>
+      <w:pPr>
+        <w:pStyle w:val="Heading3"/>
+      </w:pPr>
+      <w:r>
+        <w:t xml:space="preserve">Implementation Blueprint</w:t>
+      </w:r>
+    </w:p>
+    <w:p>
+      <w:pPr>
+        <w:pStyle w:val="FirstParagraph"/>
+      </w:pPr>
+      <w:r>
+        <w:rPr>
+          <w:b/>
+          <w:bCs/>
+        </w:rPr>
+        <w:t xml:space="preserve">Conference Approach:</w:t>
+      </w:r>
+      <w:r>
+        <w:t xml:space="preserve"> </w:t>
+      </w:r>
+      <w:r>
+        <w:t xml:space="preserve">Contact VidCon’s programming team six to eight months before the annual conference with a proposal. Position the live performance not as a podcast recording but as a</w:t>
+      </w:r>
+      <w:r>
+        <w:t xml:space="preserve"> </w:t>
+      </w:r>
+      <w:r>
+        <w:t xml:space="preserve">“creator business education session”</w:t>
+      </w:r>
+      <w:r>
+        <w:t xml:space="preserve"> </w:t>
+      </w:r>
+      <w:r>
+        <w:t xml:space="preserve">— this framing fits VidCon’s session categories and is more likely to receive a programmed slot than an entertainment pitch.</w:t>
+      </w:r>
+    </w:p>
+    <w:p>
+      <w:pPr>
+        <w:pStyle w:val="BodyText"/>
+      </w:pPr>
+      <w:r>
+        <w:rPr>
+          <w:b/>
+          <w:bCs/>
+        </w:rPr>
+        <w:t xml:space="preserve">Episode Selection:</w:t>
+      </w:r>
+      <w:r>
+        <w:t xml:space="preserve"> </w:t>
+      </w:r>
+      <w:r>
+        <w:t xml:space="preserve">Choose the live performance episode in advance based on maximum emotional resonance with the conference audience. The ideal episode features a deal situation that is universally relatable for mid-tier creators (50,000 to 500,000 followers) — the exact demographic that attends creator economy conferences in the highest numbers.</w:t>
+      </w:r>
+    </w:p>
+    <w:p>
+      <w:pPr>
+        <w:pStyle w:val="BodyText"/>
+      </w:pPr>
+      <w:r>
+        <w:rPr>
+          <w:b/>
+          <w:bCs/>
+        </w:rPr>
+        <w:t xml:space="preserve">Live Q&amp;A Component:</w:t>
+      </w:r>
+      <w:r>
+        <w:t xml:space="preserve"> </w:t>
+      </w:r>
+      <w:r>
+        <w:t xml:space="preserve">Bring the episode’s creator subject on stage after the narration for a live Q&amp;A. The audience’s questions are both the most authentic market research DealStage can conduct and the most compelling content in the event — real creators asking real questions of someone who has been through the exact situation they are trying to navigate.</w:t>
+      </w:r>
+    </w:p>
+    <w:p>
+      <w:pPr>
+        <w:pStyle w:val="BodyText"/>
+      </w:pPr>
+      <w:r>
+        <w:rPr>
+          <w:b/>
+          <w:bCs/>
+        </w:rPr>
+        <w:t xml:space="preserve">Three-Camera Film Package:</w:t>
+      </w:r>
+      <w:r>
+        <w:t xml:space="preserve"> </w:t>
+      </w:r>
+      <w:r>
+        <w:t xml:space="preserve">Film the live performance with three cameras: stage wide shot, crowd reaction, and host close-up. The crowd reaction footage is published to DealStage’s social channels the same day of the event. This is the content that drives post-event discovery from people who did not attend.</w:t>
+      </w:r>
+    </w:p>
+    <w:p>
+      <w:pPr>
+        <w:pStyle w:val="BodyText"/>
+      </w:pPr>
+      <w:r>
+        <w:rPr>
+          <w:b/>
+          <w:bCs/>
+        </w:rPr>
+        <w:t xml:space="preserve">Season Launch Positioning:</w:t>
+      </w:r>
+      <w:r>
+        <w:t xml:space="preserve"> </w:t>
+      </w:r>
+      <w:r>
+        <w:t xml:space="preserve">Use the live episode as the season’s promotional anchor:</w:t>
+      </w:r>
+      <w:r>
+        <w:t xml:space="preserve"> </w:t>
+      </w:r>
+      <w:r>
+        <w:t xml:space="preserve">“This season of The Negotiation begins live at VidCon.”</w:t>
+      </w:r>
+      <w:r>
+        <w:t xml:space="preserve"> </w:t>
+      </w:r>
+      <w:r>
+        <w:t xml:space="preserve">This framing drives conference attendance among the creator audience and creates a media event out of a podcast season premiere — two outcomes that normally require separate campaigns.</w:t>
+      </w:r>
+    </w:p>
+    <w:p>
+      <w:pPr>
+        <w:pStyle w:val="BodyText"/>
+      </w:pPr>
+      <w:r>
+        <w:rPr>
+          <w:b/>
+          <w:bCs/>
+        </w:rPr>
+        <w:t xml:space="preserve">Impact Rating:</w:t>
+      </w:r>
+      <w:r>
+        <w:t xml:space="preserve"> </w:t>
+      </w:r>
+      <w:r>
+        <w:t xml:space="preserve">High |</w:t>
+      </w:r>
+      <w:r>
+        <w:t xml:space="preserve"> </w:t>
+      </w:r>
+      <w:r>
+        <w:rPr>
+          <w:b/>
+          <w:bCs/>
+        </w:rPr>
+        <w:t xml:space="preserve">Effort Rating:</w:t>
+      </w:r>
+      <w:r>
+        <w:t xml:space="preserve"> </w:t>
+      </w:r>
+      <w:r>
+        <w:t xml:space="preserve">Medium</w:t>
+      </w:r>
+    </w:p>
+    <w:p>
+      <w:r>
+        <w:pict>
+          <v:rect style="width:0;height:1.5pt" o:hralign="center" o:hrstd="t" o:hr="t"/>
+        </w:pict>
+      </w:r>
+    </w:p>
+    <w:bookmarkEnd w:id="160"/>
+    <w:bookmarkEnd w:id="161"/>
+    <w:bookmarkStart w:id="165" w:name="X3243b3c50c75ec52897925a5d9807cc167e65eb"/>
+    <w:p>
+      <w:pPr>
+        <w:pStyle w:val="Heading2"/>
+      </w:pPr>
+      <w:r>
+        <w:t xml:space="preserve">[NEW] 8.4 — Creator Confessions With a Regulatory Hook: Partnering to Shape Creator Contract Policy</w:t>
+      </w:r>
+    </w:p>
+    <w:bookmarkStart w:id="162" w:name="concept-overview-3"/>
+    <w:p>
+      <w:pPr>
+        <w:pStyle w:val="Heading3"/>
+      </w:pPr>
+      <w:r>
+        <w:t xml:space="preserve">Concept Overview</w:t>
+      </w:r>
+    </w:p>
+    <w:p>
+      <w:pPr>
+        <w:pStyle w:val="FirstParagraph"/>
+      </w:pPr>
+      <w:r>
+        <w:t xml:space="preserve">Formalize a research partnership with a creator economy legal advocacy organization to use anonymized Creator Confessions episode data as evidence in ongoing regulatory discussions about creator contract fairness. The partnership transforms Creator Confessions from a valuable podcast into the creator economy’s most important policy document — and that positioning, stated explicitly in the show’s submission guidelines, attracts the quality and significance of submissions that no marketing campaign can generate.</w:t>
+      </w:r>
+    </w:p>
+    <w:bookmarkEnd w:id="162"/>
+    <w:bookmarkStart w:id="163" w:name="X2ab79f34037346e2033a395ec4e03d6a70208e8"/>
+    <w:p>
+      <w:pPr>
+        <w:pStyle w:val="Heading3"/>
+      </w:pPr>
+      <w:r>
+        <w:t xml:space="preserve">Why Regulatory Impact Changes the Show’s Submission Quality</w:t>
+      </w:r>
+    </w:p>
+    <w:p>
+      <w:pPr>
+        <w:pStyle w:val="FirstParagraph"/>
+      </w:pPr>
+      <w:r>
+        <w:t xml:space="preserve">When creators know that their anonymous story might influence FTC guidance on creator contract disclosure requirements, they submit their most important, most difficult, and most legally significant experiences. The show’s content quality compounds with the policy positioning. Serial influenced criminal justice discussions. Dirty John changed conversations about coercive relationships. Creator Confessions has the structural foundation to be the podcast that changes creator contract law — and that potential is the show’s most powerful acquisition tool.</w:t>
+      </w:r>
+    </w:p>
+    <w:bookmarkEnd w:id="163"/>
+    <w:bookmarkStart w:id="164" w:name="implementation-blueprint-3"/>
+    <w:p>
+      <w:pPr>
+        <w:pStyle w:val="Heading3"/>
+      </w:pPr>
+      <w:r>
+        <w:t xml:space="preserve">Implementation Blueprint</w:t>
+      </w:r>
+    </w:p>
+    <w:p>
+      <w:pPr>
+        <w:pStyle w:val="FirstParagraph"/>
+      </w:pPr>
+      <w:r>
+        <w:rPr>
+          <w:b/>
+          <w:bCs/>
+        </w:rPr>
+        <w:t xml:space="preserve">Submission Language:</w:t>
+      </w:r>
+      <w:r>
+        <w:t xml:space="preserve"> </w:t>
+      </w:r>
+      <w:r>
+        <w:t xml:space="preserve">In the first season, include in every submission channel:</w:t>
+      </w:r>
+      <w:r>
+        <w:t xml:space="preserve"> </w:t>
+      </w:r>
+      <w:r>
+        <w:t xml:space="preserve">“Your anonymous story may be used as part of a creator economy contract transparency research project.”</w:t>
+      </w:r>
+      <w:r>
+        <w:t xml:space="preserve"> </w:t>
+      </w:r>
+      <w:r>
+        <w:t xml:space="preserve">This is not a legal obligation — it is a framing choice that changes the quality of what creators submit.</w:t>
+      </w:r>
+    </w:p>
+    <w:p>
+      <w:pPr>
+        <w:pStyle w:val="BodyText"/>
+      </w:pPr>
+      <w:r>
+        <w:rPr>
+          <w:b/>
+          <w:bCs/>
+        </w:rPr>
+        <w:t xml:space="preserve">Advisory Board:</w:t>
+      </w:r>
+      <w:r>
+        <w:t xml:space="preserve"> </w:t>
+      </w:r>
+      <w:r>
+        <w:t xml:space="preserve">Engage a creator economy legal advocacy organization as an advisory board member for the show. The organization lends credibility to the research framing; Creator Confessions lends the organization a data collection mechanism they could not build independently.</w:t>
+      </w:r>
+    </w:p>
+    <w:p>
+      <w:pPr>
+        <w:pStyle w:val="BodyText"/>
+      </w:pPr>
+      <w:r>
+        <w:rPr>
+          <w:b/>
+          <w:bCs/>
+        </w:rPr>
+        <w:t xml:space="preserve">The Policy Report:</w:t>
+      </w:r>
+      <w:r>
+        <w:t xml:space="preserve"> </w:t>
+      </w:r>
+      <w:r>
+        <w:t xml:space="preserve">After Season 1, compile an anonymized data report from all submissions: the most common contract abuse patterns, the most frequent payment structure problems, and the most egregious exclusivity clause architectures. Present this report to the FTC’s Office of Policy Planning and brief creator economy journalists at The Information, Variety, and AdWeek on the findings before release.</w:t>
+      </w:r>
+    </w:p>
+    <w:p>
+      <w:pPr>
+        <w:pStyle w:val="BodyText"/>
+      </w:pPr>
+      <w:r>
+        <w:rPr>
+          <w:b/>
+          <w:bCs/>
+        </w:rPr>
+        <w:t xml:space="preserve">Annual</w:t>
+      </w:r>
+      <w:r>
+        <w:rPr>
+          <w:b/>
+          <w:bCs/>
+        </w:rPr>
+        <w:t xml:space="preserve"> </w:t>
+      </w:r>
+      <w:r>
+        <w:rPr>
+          <w:b/>
+          <w:bCs/>
+        </w:rPr>
+        <w:t xml:space="preserve">“What Changed”</w:t>
+      </w:r>
+      <w:r>
+        <w:rPr>
+          <w:b/>
+          <w:bCs/>
+        </w:rPr>
+        <w:t xml:space="preserve"> </w:t>
+      </w:r>
+      <w:r>
+        <w:rPr>
+          <w:b/>
+          <w:bCs/>
+        </w:rPr>
+        <w:t xml:space="preserve">Episode:</w:t>
+      </w:r>
+      <w:r>
+        <w:t xml:space="preserve"> </w:t>
+      </w:r>
+      <w:r>
+        <w:t xml:space="preserve">In Season 2, feature one episode per season specifically on a contract issue that has been addressed by regulatory guidance or platform policy changes since the previous season.</w:t>
+      </w:r>
+      <w:r>
+        <w:t xml:space="preserve"> </w:t>
+      </w:r>
+      <w:r>
+        <w:t xml:space="preserve">“Here is what changed because you told us”</w:t>
+      </w:r>
+      <w:r>
+        <w:t xml:space="preserve"> </w:t>
+      </w:r>
+      <w:r>
+        <w:t xml:space="preserve">is the most powerful statement a content platform can make to its audience.</w:t>
+      </w:r>
+    </w:p>
+    <w:p>
+      <w:pPr>
+        <w:pStyle w:val="BodyText"/>
+      </w:pPr>
+      <w:r>
+        <w:rPr>
+          <w:b/>
+          <w:bCs/>
+        </w:rPr>
+        <w:t xml:space="preserve">Impact Rating:</w:t>
+      </w:r>
+      <w:r>
+        <w:t xml:space="preserve"> </w:t>
+      </w:r>
+      <w:r>
+        <w:t xml:space="preserve">High |</w:t>
+      </w:r>
+      <w:r>
+        <w:t xml:space="preserve"> </w:t>
+      </w:r>
+      <w:r>
+        <w:rPr>
+          <w:b/>
+          <w:bCs/>
+        </w:rPr>
+        <w:t xml:space="preserve">Effort Rating:</w:t>
+      </w:r>
+      <w:r>
+        <w:t xml:space="preserve"> </w:t>
+      </w:r>
+      <w:r>
+        <w:t xml:space="preserve">Medium</w:t>
+      </w:r>
+    </w:p>
+    <w:p>
+      <w:r>
+        <w:pict>
+          <v:rect style="width:0;height:1.5pt" o:hralign="center" o:hrstd="t" o:hr="t"/>
+        </w:pict>
+      </w:r>
+    </w:p>
+    <w:bookmarkEnd w:id="164"/>
+    <w:bookmarkEnd w:id="165"/>
+    <w:bookmarkStart w:id="169" w:name="X4b8abfdddb26298c28c7a18af33ca11c29caa91"/>
+    <w:p>
+      <w:pPr>
+        <w:pStyle w:val="Heading2"/>
+      </w:pPr>
+      <w:r>
+        <w:t xml:space="preserve">[NEW] 8.5 — The Brand Side as a Netflix Pitch: Positioning It as Chef’s Table for Brand Marketing</w:t>
+      </w:r>
+    </w:p>
+    <w:bookmarkStart w:id="166" w:name="concept-overview-4"/>
+    <w:p>
+      <w:pPr>
+        <w:pStyle w:val="Heading3"/>
+      </w:pPr>
+      <w:r>
+        <w:t xml:space="preserve">Concept Overview</w:t>
+      </w:r>
+    </w:p>
+    <w:p>
+      <w:pPr>
+        <w:pStyle w:val="FirstParagraph"/>
+      </w:pPr>
+      <w:r>
+        <w:t xml:space="preserve">Reposition The Brand Side as a premium streaming pitch for Netflix or HBO Max rather than a YouTube property — modeled on Netflix’s Chef’s Table as a prestige documentary format that is genuinely cinematic, uses top-tier documentary filmmakers, and commands streaming platform licensing fees rather than YouTube ad revenue.</w:t>
+      </w:r>
+    </w:p>
+    <w:p>
+      <w:pPr>
+        <w:pStyle w:val="BodyText"/>
+      </w:pPr>
+      <w:r>
+        <w:t xml:space="preserve">Chef’s Table is a show about cooking. Its real subject is obsession, craft, and the human drama of people trying to build something meaningful in a chaotic profession. The Brand Side is a show about marketing. Its real subject is the same: people trying to build something meaningful with limited budgets, imperfect information, and real consequences for failure. Shot with the visual ambition of a prestige documentary — deliberate pacing, intimate access, the kind of cinematography that treats a brand brief meeting like a culinary scene — it becomes content that streaming platforms acquire for their prestige catalog, not their reality programming shelf.</w:t>
+      </w:r>
+    </w:p>
+    <w:bookmarkEnd w:id="166"/>
+    <w:bookmarkStart w:id="167" w:name="X564dc45727aeb2a1a697156fb3ba0e749bd93eb"/>
+    <w:p>
+      <w:pPr>
+        <w:pStyle w:val="Heading3"/>
+      </w:pPr>
+      <w:r>
+        <w:t xml:space="preserve">The Commercial Case for Streaming Over YouTube</w:t>
+      </w:r>
+    </w:p>
+    <w:p>
+      <w:pPr>
+        <w:pStyle w:val="FirstParagraph"/>
+      </w:pPr>
+      <w:r>
+        <w:t xml:space="preserve">The document’s current $240,000 Season 1 budget is calibrated for YouTube production values and YouTube ad revenue. A Netflix licensing deal for a prestige documentary series typically commands $300,000 to $600,000 per episode for independent producers — a multiplier that changes the show’s economics entirely. Additionally, Netflix’s distribution reaches audiences that YouTube’s algorithm never surfaces The Brand Side to: the Succession viewer, the financial documentary viewer, the executive who does not watch YouTube but has watched every episode of Chef’s Table.</w:t>
+      </w:r>
+    </w:p>
+    <w:bookmarkEnd w:id="167"/>
+    <w:bookmarkStart w:id="168" w:name="implementation-blueprint-4"/>
+    <w:p>
+      <w:pPr>
+        <w:pStyle w:val="Heading3"/>
+      </w:pPr>
+      <w:r>
+        <w:t xml:space="preserve">Implementation Blueprint</w:t>
+      </w:r>
+    </w:p>
+    <w:p>
+      <w:pPr>
+        <w:pStyle w:val="FirstParagraph"/>
+      </w:pPr>
+      <w:r>
+        <w:rPr>
+          <w:b/>
+          <w:bCs/>
+        </w:rPr>
+        <w:t xml:space="preserve">Step 1 — Premium Two-Episode Package:</w:t>
+      </w:r>
+      <w:r>
+        <w:t xml:space="preserve"> </w:t>
+      </w:r>
+      <w:r>
+        <w:t xml:space="preserve">Before any YouTube release, develop a premium visual treatment for the first two episodes at $80,000 to $100,000 per episode. Hire a documentary director with streaming platform credits — someone whose name appears in Netflix or HBO Max credits and whose visual style can be positioned as prestige.</w:t>
+      </w:r>
+    </w:p>
+    <w:p>
+      <w:pPr>
+        <w:pStyle w:val="BodyText"/>
+      </w:pPr>
+      <w:r>
+        <w:rPr>
+          <w:b/>
+          <w:bCs/>
+        </w:rPr>
+        <w:t xml:space="preserve">Step 2 — Simultaneous Submission:</w:t>
+      </w:r>
+      <w:r>
+        <w:t xml:space="preserve"> </w:t>
+      </w:r>
+      <w:r>
+        <w:t xml:space="preserve">Submit to Netflix’s documentary programming division and HBO Max’s unscripted team simultaneously. The two-episode package is the pitch reel. A written treatment alone is insufficient for a format that depends on visual execution — the footage has to do the work.</w:t>
+      </w:r>
+    </w:p>
+    <w:p>
+      <w:pPr>
+        <w:pStyle w:val="BodyText"/>
+      </w:pPr>
+      <w:r>
+        <w:rPr>
+          <w:b/>
+          <w:bCs/>
+        </w:rPr>
+        <w:t xml:space="preserve">Step 3 — YouTube as Downstream Rights:</w:t>
+      </w:r>
+      <w:r>
+        <w:t xml:space="preserve"> </w:t>
+      </w:r>
+      <w:r>
+        <w:t xml:space="preserve">If a streaming deal is secured, retain YouTube rights with a 6-month exclusivity window following the streaming premiere. The YouTube audience becomes a downstream audience that discovers the show after its prestige streaming launch — a more valuable positioning than YouTube-first.</w:t>
+      </w:r>
+    </w:p>
+    <w:p>
+      <w:pPr>
+        <w:pStyle w:val="BodyText"/>
+      </w:pPr>
+      <w:r>
+        <w:rPr>
+          <w:b/>
+          <w:bCs/>
+        </w:rPr>
+        <w:t xml:space="preserve">Step 4 — Elevated Brand Participation Fees:</w:t>
+      </w:r>
+      <w:r>
+        <w:t xml:space="preserve"> </w:t>
+      </w:r>
+      <w:r>
+        <w:t xml:space="preserve">Structure brand participation fees at $15,000 to $25,000 per brand (up from the current $5,000) based on the prestige format’s elevated reach, production quality, and streaming platform audience demographics. The brand is not buying a YouTube feature — they are buying a Netflix documentary episode.</w:t>
+      </w:r>
+    </w:p>
+    <w:p>
+      <w:pPr>
+        <w:pStyle w:val="BodyText"/>
+      </w:pPr>
+      <w:r>
+        <w:rPr>
+          <w:b/>
+          <w:bCs/>
+        </w:rPr>
+        <w:t xml:space="preserve">Step 5 — The Data Differentiation Pitch:</w:t>
+      </w:r>
+      <w:r>
+        <w:t xml:space="preserve"> </w:t>
+      </w:r>
+      <w:r>
+        <w:t xml:space="preserve">Frame the Netflix pitch around what no other documentary in this category has: real-time AI deal analysis of the brands being filmed.</w:t>
+      </w:r>
+      <w:r>
+        <w:t xml:space="preserve"> </w:t>
+      </w:r>
+      <w:r>
+        <w:t xml:space="preserve">“No other documentary series about brand marketing has access to live intelligence on whether the decisions being made on camera are correct. This is Chef’s Table with business intelligence.”</w:t>
+      </w:r>
+    </w:p>
+    <w:p>
+      <w:pPr>
+        <w:pStyle w:val="BodyText"/>
+      </w:pPr>
+      <w:r>
+        <w:rPr>
+          <w:b/>
+          <w:bCs/>
+        </w:rPr>
+        <w:t xml:space="preserve">Impact Rating:</w:t>
+      </w:r>
+      <w:r>
+        <w:t xml:space="preserve"> </w:t>
+      </w:r>
+      <w:r>
+        <w:t xml:space="preserve">High |</w:t>
+      </w:r>
+      <w:r>
+        <w:t xml:space="preserve"> </w:t>
+      </w:r>
+      <w:r>
+        <w:rPr>
+          <w:b/>
+          <w:bCs/>
+        </w:rPr>
+        <w:t xml:space="preserve">Effort Rating:</w:t>
+      </w:r>
+      <w:r>
+        <w:t xml:space="preserve"> </w:t>
+      </w:r>
+      <w:r>
+        <w:t xml:space="preserve">High</w:t>
+      </w:r>
+    </w:p>
+    <w:p>
+      <w:r>
+        <w:pict>
+          <v:rect style="width:0;height:1.5pt" o:hralign="center" o:hrstd="t" o:hr="t"/>
+        </w:pict>
+      </w:r>
+    </w:p>
+    <w:bookmarkEnd w:id="168"/>
+    <w:bookmarkEnd w:id="169"/>
+    <w:bookmarkStart w:id="172" w:name="X24ede802554a084e6bb5710eff2b8eeee981fde"/>
+    <w:p>
+      <w:pPr>
+        <w:pStyle w:val="Heading2"/>
+      </w:pPr>
+      <w:r>
+        <w:t xml:space="preserve">[NEW] 8.6 — TikTok LIVE First: Building the Live Gameshow as a Platform Negotiation Tool</w:t>
+      </w:r>
+    </w:p>
+    <w:bookmarkStart w:id="170" w:name="concept-overview-5"/>
+    <w:p>
+      <w:pPr>
+        <w:pStyle w:val="Heading3"/>
+      </w:pPr>
+      <w:r>
+        <w:t xml:space="preserve">Concept Overview</w:t>
+      </w:r>
+    </w:p>
+    <w:p>
+      <w:pPr>
+        <w:pStyle w:val="FirstParagraph"/>
+      </w:pPr>
+      <w:r>
+        <w:t xml:space="preserve">Before pitching the Deal or No Deal: Small Creator Edition live gameshow format to YouTube, develop it on TikTok LIVE as a Year 1 property. Use TikTok’s live gifting revenue model as the show’s primary Year 1 monetization while simultaneously using TikTok’s demonstrated interest as leverage in negotiations with YouTube for a more favorable revenue share agreement.</w:t>
+      </w:r>
+    </w:p>
+    <w:p>
+      <w:pPr>
+        <w:pStyle w:val="BodyText"/>
+      </w:pPr>
+      <w:r>
+        <w:t xml:space="preserve">TikTok LIVE has generated a new category of creator income through virtual gifting that is both commercially significant and completely unexplored as a gameshow format. The live gifting mechanic — where audience members send virtual gifts to influence the on-screen outcome — transforms passive viewers into active participants with a financial stake in the outcome. It is, structurally, a live gameshow mechanic that TikTok has already built and validated.</w:t>
+      </w:r>
+    </w:p>
+    <w:bookmarkEnd w:id="170"/>
+    <w:bookmarkStart w:id="171" w:name="implementation-blueprint-5"/>
+    <w:p>
+      <w:pPr>
+        <w:pStyle w:val="Heading3"/>
+      </w:pPr>
+      <w:r>
+        <w:t xml:space="preserve">Implementation Blueprint</w:t>
+      </w:r>
+    </w:p>
+    <w:p>
+      <w:pPr>
+        <w:pStyle w:val="FirstParagraph"/>
+      </w:pPr>
+      <w:r>
+        <w:rPr>
+          <w:b/>
+          <w:bCs/>
+        </w:rPr>
+        <w:t xml:space="preserve">Step 1 — Unannounced Test Streams:</w:t>
+      </w:r>
+      <w:r>
+        <w:t xml:space="preserve"> </w:t>
+      </w:r>
+      <w:r>
+        <w:t xml:space="preserve">Produce three to four unannounced test streams as live prototypes on TikTok. Small creator contestants, $5,000 to $10,000 real deal stakes, standard production quality. Measure concurrent viewers, gift revenue per stream, and audience retention at key decision moments.</w:t>
+      </w:r>
+    </w:p>
+    <w:p>
+      <w:pPr>
+        <w:pStyle w:val="BodyText"/>
+      </w:pPr>
+      <w:r>
+        <w:rPr>
+          <w:b/>
+          <w:bCs/>
+        </w:rPr>
+        <w:t xml:space="preserve">Step 2 — Validation Threshold:</w:t>
+      </w:r>
+      <w:r>
+        <w:t xml:space="preserve"> </w:t>
+      </w:r>
+      <w:r>
+        <w:t xml:space="preserve">Define success criteria before starting: 5,000+ concurrent viewers, $2,000+ in gift revenue per stream, and above 40% audience retention through the deal decision moment. If the test streams hit these targets, the format is validated on TikTok.</w:t>
+      </w:r>
+    </w:p>
+    <w:p>
+      <w:pPr>
+        <w:pStyle w:val="BodyText"/>
+      </w:pPr>
+      <w:r>
+        <w:rPr>
+          <w:b/>
+          <w:bCs/>
+        </w:rPr>
+        <w:t xml:space="preserve">Step 3 — TikTok Partnership Conversation:</w:t>
+      </w:r>
+      <w:r>
+        <w:t xml:space="preserve"> </w:t>
+      </w:r>
+      <w:r>
+        <w:t xml:space="preserve">If tests validate, approach TikTok’s creator partnerships team for a formal co-production conversation. A TikTok letter of intent or co-production agreement — even a preliminary one — becomes the leverage document in YouTube negotiations.</w:t>
+      </w:r>
+    </w:p>
+    <w:p>
+      <w:pPr>
+        <w:pStyle w:val="BodyText"/>
+      </w:pPr>
+      <w:r>
+        <w:rPr>
+          <w:b/>
+          <w:bCs/>
+        </w:rPr>
+        <w:t xml:space="preserve">Step 4 — YouTube Negotiation:</w:t>
+      </w:r>
+      <w:r>
+        <w:t xml:space="preserve"> </w:t>
+      </w:r>
+      <w:r>
+        <w:t xml:space="preserve">Contact YouTube’s live programming team:</w:t>
+      </w:r>
+      <w:r>
+        <w:t xml:space="preserve"> </w:t>
+      </w:r>
+      <w:r>
+        <w:t xml:space="preserve">“We have a competing interest from TikTok for this live gameshow format. We prefer YouTube’s creator ecosystem and the audience that platform reaches. What can you offer?”</w:t>
+      </w:r>
+      <w:r>
+        <w:t xml:space="preserve"> </w:t>
+      </w:r>
+      <w:r>
+        <w:t xml:space="preserve">This is a standard multi-platform negotiation strategy and gives DealStage leverage it does not have when approaching YouTube first.</w:t>
+      </w:r>
+    </w:p>
+    <w:p>
+      <w:pPr>
+        <w:pStyle w:val="BodyText"/>
+      </w:pPr>
+      <w:r>
+        <w:rPr>
+          <w:b/>
+          <w:bCs/>
+        </w:rPr>
+        <w:t xml:space="preserve">Step 5 — Dual-Platform Distribution:</w:t>
+      </w:r>
+      <w:r>
+        <w:t xml:space="preserve"> </w:t>
+      </w:r>
+      <w:r>
+        <w:t xml:space="preserve">Structure any deal to maintain distribution rights across both platforms. The format does not cannibalize between TikTok and YouTube audiences — these are largely non-overlapping viewer pools, and dual-platform distribution expands total reach rather than splitting it.</w:t>
+      </w:r>
+    </w:p>
+    <w:p>
+      <w:pPr>
+        <w:pStyle w:val="BodyText"/>
+      </w:pPr>
+      <w:r>
+        <w:rPr>
+          <w:b/>
+          <w:bCs/>
+        </w:rPr>
+        <w:t xml:space="preserve">Year 2 Physical Event:</w:t>
+      </w:r>
+      <w:r>
+        <w:t xml:space="preserve"> </w:t>
+      </w:r>
+      <w:r>
+        <w:t xml:space="preserve">Bring the live format to a physical event — VidCon or a DealStage-produced creator economy conference — creating the live in-room audience layer that elevates the format from digital to experiential.</w:t>
+      </w:r>
+    </w:p>
+    <w:p>
+      <w:pPr>
+        <w:pStyle w:val="BodyText"/>
+      </w:pPr>
+      <w:r>
+        <w:rPr>
+          <w:b/>
+          <w:bCs/>
+        </w:rPr>
+        <w:t xml:space="preserve">Impact Rating:</w:t>
+      </w:r>
+      <w:r>
+        <w:t xml:space="preserve"> </w:t>
+      </w:r>
+      <w:r>
+        <w:t xml:space="preserve">High |</w:t>
+      </w:r>
+      <w:r>
+        <w:t xml:space="preserve"> </w:t>
+      </w:r>
+      <w:r>
+        <w:rPr>
+          <w:b/>
+          <w:bCs/>
+        </w:rPr>
+        <w:t xml:space="preserve">Effort Rating:</w:t>
+      </w:r>
+      <w:r>
+        <w:t xml:space="preserve"> </w:t>
+      </w:r>
+      <w:r>
+        <w:t xml:space="preserve">Medium</w:t>
+      </w:r>
+    </w:p>
+    <w:p>
+      <w:r>
+        <w:pict>
+          <v:rect style="width:0;height:1.5pt" o:hralign="center" o:hrstd="t" o:hr="t"/>
+        </w:pict>
+      </w:r>
+    </w:p>
+    <w:bookmarkEnd w:id="171"/>
+    <w:bookmarkEnd w:id="172"/>
+    <w:bookmarkStart w:id="176" w:name="X3d873fc8e34298fb610f7ff3e858ca53d2be6f7"/>
+    <w:p>
+      <w:pPr>
+        <w:pStyle w:val="Heading2"/>
+      </w:pPr>
+      <w:r>
+        <w:t xml:space="preserve">[NEW] 8.7 — The Independent AI Accuracy Study: Third-Party Validation as the Empire’s Foundation Stone</w:t>
+      </w:r>
+    </w:p>
+    <w:bookmarkStart w:id="173" w:name="concept-overview-6"/>
+    <w:p>
+      <w:pPr>
+        <w:pStyle w:val="Heading3"/>
+      </w:pPr>
+      <w:r>
+        <w:t xml:space="preserve">Concept Overview</w:t>
+      </w:r>
+    </w:p>
+    <w:p>
+      <w:pPr>
+        <w:pStyle w:val="FirstParagraph"/>
+      </w:pPr>
+      <w:r>
+        <w:t xml:space="preserve">Commission an independent academic research team — MIT Media Lab, Stanford’s Human-Centered AI Institute, or Carnegie Mellon’s Machine Learning Department — to conduct and publish a peer-reviewed study validating DealStage’s AI match score accuracy against real deal outcomes. Publish the study ahead of any platform fundraise or TV pitch.</w:t>
+      </w:r>
+    </w:p>
+    <w:p>
+      <w:pPr>
+        <w:pStyle w:val="BodyText"/>
+      </w:pPr>
+      <w:r>
+        <w:t xml:space="preserve">The entire DealStage media empire’s value proposition rests on one claim: the AI match score is real, accurate, and meaningful. Every show, every podcast, every platform subscription assumes that audiences and users trust that claim. Right now, the only evidence is DealStage’s own assertion. A peer-reviewed academic validation study changes the category of that claim from</w:t>
+      </w:r>
+      <w:r>
+        <w:t xml:space="preserve"> </w:t>
+      </w:r>
+      <w:r>
+        <w:t xml:space="preserve">“we say so”</w:t>
+      </w:r>
+      <w:r>
+        <w:t xml:space="preserve"> </w:t>
+      </w:r>
+      <w:r>
+        <w:t xml:space="preserve">to</w:t>
+      </w:r>
+      <w:r>
+        <w:t xml:space="preserve"> </w:t>
+      </w:r>
+      <w:r>
+        <w:t xml:space="preserve">“independent researchers at MIT confirmed it.”</w:t>
+      </w:r>
+    </w:p>
+    <w:bookmarkEnd w:id="173"/>
+    <w:bookmarkStart w:id="174" w:name="Xb0ee9dd100ccb2ccc24bfbbeaa89ad157ba4e2b"/>
+    <w:p>
+      <w:pPr>
+        <w:pStyle w:val="Heading3"/>
+      </w:pPr>
+      <w:r>
+        <w:t xml:space="preserve">Why This Is the Empire’s Most Leveraged Single Investment</w:t>
+      </w:r>
+    </w:p>
+    <w:p>
+      <w:pPr>
+        <w:pStyle w:val="FirstParagraph"/>
+      </w:pPr>
+      <w:r>
+        <w:t xml:space="preserve">For the TV show pitch: it answers the network executive’s hardest question.</w:t>
+      </w:r>
+      <w:r>
+        <w:t xml:space="preserve"> </w:t>
+      </w:r>
+      <w:r>
+        <w:t xml:space="preserve">“What happens if the AI is wrong on camera?”</w:t>
+      </w:r>
+      <w:r>
+        <w:t xml:space="preserve"> </w:t>
+      </w:r>
+      <w:r>
+        <w:t xml:space="preserve">becomes answerable:</w:t>
+      </w:r>
+      <w:r>
+        <w:t xml:space="preserve"> </w:t>
+      </w:r>
+      <w:r>
+        <w:t xml:space="preserve">“Our AI has been independently validated to X% accuracy by researchers at [institution]. Here is the published study.”</w:t>
+      </w:r>
+      <w:r>
+        <w:t xml:space="preserve"> </w:t>
+      </w:r>
+      <w:r>
+        <w:t xml:space="preserve">That answer closes rooms.</w:t>
+      </w:r>
+    </w:p>
+    <w:p>
+      <w:pPr>
+        <w:pStyle w:val="BodyText"/>
+      </w:pPr>
+      <w:r>
+        <w:t xml:space="preserve">For the investor pitch: it converts the platform’s central claim from marketing language to peer-reviewed science. Investors who would otherwise perform their own diligence on the AI’s accuracy claims are handed a published study instead — saving due diligence time and increasing confidence in the platform’s defensibility.</w:t>
+      </w:r>
+    </w:p>
+    <w:p>
+      <w:pPr>
+        <w:pStyle w:val="BodyText"/>
+      </w:pPr>
+      <w:r>
+        <w:t xml:space="preserve">For the platform subscription pitch: it converts skeptical brand marketing executives who have seen dozens of AI marketing tools make accuracy claims without evidence. A published study is the claim they cannot dismiss.</w:t>
+      </w:r>
+    </w:p>
+    <w:bookmarkEnd w:id="174"/>
+    <w:bookmarkStart w:id="175" w:name="implementation-blueprint-6"/>
+    <w:p>
+      <w:pPr>
+        <w:pStyle w:val="Heading3"/>
+      </w:pPr>
+      <w:r>
+        <w:t xml:space="preserve">Implementation Blueprint</w:t>
+      </w:r>
+    </w:p>
+    <w:p>
+      <w:pPr>
+        <w:pStyle w:val="FirstParagraph"/>
+      </w:pPr>
+      <w:r>
+        <w:rPr>
+          <w:b/>
+          <w:bCs/>
+        </w:rPr>
+        <w:t xml:space="preserve">Step 1 — Research Partner Identification:</w:t>
+      </w:r>
+      <w:r>
+        <w:t xml:space="preserve"> </w:t>
+      </w:r>
+      <w:r>
+        <w:t xml:space="preserve">Identify three independent research teams with expertise in recommendation system accuracy and marketplace AI evaluation. Approach them with a research partnership proposal that offers data access (with appropriate confidentiality agreements) in exchange for publication rights.</w:t>
+      </w:r>
+    </w:p>
+    <w:p>
+      <w:pPr>
+        <w:pStyle w:val="BodyText"/>
+      </w:pPr>
+      <w:r>
+        <w:rPr>
+          <w:b/>
+          <w:bCs/>
+        </w:rPr>
+        <w:t xml:space="preserve">Step 2 — Study Design:</w:t>
+      </w:r>
+      <w:r>
+        <w:t xml:space="preserve"> </w:t>
+      </w:r>
+      <w:r>
+        <w:t xml:space="preserve">Structure the study to measure three specific dimensions of accuracy: (1) match score accuracy against deal outcome — did high-scoring matches convert to better deal performance than low-scoring matches?, (2) rate accuracy — how close were AI-recommended rates to actual closed deal rates as a percentage variance?, (3) audience alignment accuracy — how accurate were the AI’s demographic and psychographic match predictions against post-campaign measurement data?</w:t>
+      </w:r>
+    </w:p>
+    <w:p>
+      <w:pPr>
+        <w:pStyle w:val="BodyText"/>
+      </w:pPr>
+      <w:r>
+        <w:rPr>
+          <w:b/>
+          <w:bCs/>
+        </w:rPr>
+        <w:t xml:space="preserve">Step 3 — Timeline Integration:</w:t>
+      </w:r>
+      <w:r>
+        <w:t xml:space="preserve"> </w:t>
+      </w:r>
+      <w:r>
+        <w:t xml:space="preserve">Build the study into the Series A fundraising timeline. If the study can complete within 12 months, time the Series A close to coincide with the study’s publication — including the findings in investor materials at the moment they are freshest.</w:t>
+      </w:r>
+    </w:p>
+    <w:p>
+      <w:pPr>
+        <w:pStyle w:val="BodyText"/>
+      </w:pPr>
+      <w:r>
+        <w:rPr>
+          <w:b/>
+          <w:bCs/>
+        </w:rPr>
+        <w:t xml:space="preserve">Step 4 — Simultaneous Publication:</w:t>
+      </w:r>
+      <w:r>
+        <w:t xml:space="preserve"> </w:t>
+      </w:r>
+      <w:r>
+        <w:t xml:space="preserve">Publish the study simultaneously on DealStage’s website and through a press release to technology and marketing trade publications. The academic validation is independently newsworthy — it does not need to be attached to a funding announcement to generate press coverage.</w:t>
+      </w:r>
+    </w:p>
+    <w:p>
+      <w:pPr>
+        <w:pStyle w:val="BodyText"/>
+      </w:pPr>
+      <w:r>
+        <w:rPr>
+          <w:b/>
+          <w:bCs/>
+        </w:rPr>
+        <w:t xml:space="preserve">Step 5 — Show Bible Integration:</w:t>
+      </w:r>
+      <w:r>
+        <w:t xml:space="preserve"> </w:t>
+      </w:r>
+      <w:r>
+        <w:t xml:space="preserve">Brief the TV show’s network and streaming partners on the study findings as part of the show bible package. The validation makes the AI’s on-camera role credible to network executives who would otherwise demand liability language protecting against inaccurate AI claims on their platform.</w:t>
+      </w:r>
+    </w:p>
+    <w:p>
+      <w:pPr>
+        <w:pStyle w:val="BodyText"/>
+      </w:pPr>
+      <w:r>
+        <w:rPr>
+          <w:b/>
+          <w:bCs/>
+        </w:rPr>
+        <w:t xml:space="preserve">Impact Rating:</w:t>
+      </w:r>
+      <w:r>
+        <w:t xml:space="preserve"> </w:t>
+      </w:r>
+      <w:r>
+        <w:t xml:space="preserve">High |</w:t>
+      </w:r>
+      <w:r>
+        <w:t xml:space="preserve"> </w:t>
+      </w:r>
+      <w:r>
+        <w:rPr>
+          <w:b/>
+          <w:bCs/>
+        </w:rPr>
+        <w:t xml:space="preserve">Effort Rating:</w:t>
+      </w:r>
+      <w:r>
+        <w:t xml:space="preserve"> </w:t>
+      </w:r>
+      <w:r>
+        <w:t xml:space="preserve">Medium</w:t>
+      </w:r>
+    </w:p>
+    <w:p>
+      <w:r>
+        <w:pict>
+          <v:rect style="width:0;height:1.5pt" o:hralign="center" o:hrstd="t" o:hr="t"/>
+        </w:pict>
+      </w:r>
+    </w:p>
+    <w:bookmarkEnd w:id="175"/>
+    <w:bookmarkEnd w:id="176"/>
+    <w:bookmarkStart w:id="180" w:name="Xa8715e2b16c66f109a5c735a0c9e9fd1b63da57"/>
+    <w:p>
+      <w:pPr>
+        <w:pStyle w:val="Heading2"/>
+      </w:pPr>
+      <w:r>
+        <w:t xml:space="preserve">[NEW] 8.8 — The Boost Mechanic: Audience-Controlled Stakes Escalation in the Live Gameshow</w:t>
+      </w:r>
+    </w:p>
+    <w:bookmarkStart w:id="177" w:name="concept-overview-7"/>
+    <w:p>
+      <w:pPr>
+        <w:pStyle w:val="Heading3"/>
+      </w:pPr>
+      <w:r>
+        <w:t xml:space="preserve">Concept Overview</w:t>
+      </w:r>
+    </w:p>
+    <w:p>
+      <w:pPr>
+        <w:pStyle w:val="FirstParagraph"/>
+      </w:pPr>
+      <w:r>
+        <w:t xml:space="preserve">Build a live audience voting mechanic into Deal or No Deal: Small Creator Edition where viewers can collectively</w:t>
+      </w:r>
+      <w:r>
+        <w:t xml:space="preserve"> </w:t>
+      </w:r>
+      <w:r>
+        <w:t xml:space="preserve">“Boost the Deal”</w:t>
+      </w:r>
+      <w:r>
+        <w:t xml:space="preserve"> </w:t>
+      </w:r>
+      <w:r>
+        <w:t xml:space="preserve">— voting in real time to increase the deal value by 10% increments, funded by a pre-committed sponsor pool — so that exceptionally compelling contestants can earn deals larger than the starting offer purely through audience energy.</w:t>
+      </w:r>
+    </w:p>
+    <w:p>
+      <w:pPr>
+        <w:pStyle w:val="BodyText"/>
+      </w:pPr>
+      <w:r>
+        <w:t xml:space="preserve">The Boost mechanic solves the live gameshow’s central tension problem: how do you create genuinely escalating stakes in a live format when deal values are fixed at production time? The answer is audience-controlled stakes escalation. A $5,000 starting offer that the audience has boosted to $12,500 through collective voting has created 2.5x the emotional stakes without the show having pre-committed to the higher amount.</w:t>
+      </w:r>
+    </w:p>
+    <w:bookmarkEnd w:id="177"/>
+    <w:bookmarkStart w:id="178" w:name="the-participatory-investment-psychology"/>
+    <w:p>
+      <w:pPr>
+        <w:pStyle w:val="Heading3"/>
+      </w:pPr>
+      <w:r>
+        <w:t xml:space="preserve">The Participatory Investment Psychology</w:t>
+      </w:r>
+    </w:p>
+    <w:p>
+      <w:pPr>
+        <w:pStyle w:val="FirstParagraph"/>
+      </w:pPr>
+      <w:r>
+        <w:t xml:space="preserve">Every viewer who votes to boost a deal becomes emotionally invested in the outcome because they helped create it. This is the same psychological mechanism that drives fantasy sports engagement and crowdfunding support: when the audience’s collective action visibly changes what happens on screen, passive viewership becomes participatory investment. The show’s most compelling contestants will have audiences who are literally rooting for them with money — and watching the boost progress bar move creates a visible, real-time demonstration of that collective action.</w:t>
+      </w:r>
+    </w:p>
+    <w:bookmarkEnd w:id="178"/>
+    <w:bookmarkStart w:id="179" w:name="implementation-blueprint-7"/>
+    <w:p>
+      <w:pPr>
+        <w:pStyle w:val="Heading3"/>
+      </w:pPr>
+      <w:r>
+        <w:t xml:space="preserve">Implementation Blueprint</w:t>
+      </w:r>
+    </w:p>
+    <w:p>
+      <w:pPr>
+        <w:pStyle w:val="FirstParagraph"/>
+      </w:pPr>
+      <w:r>
+        <w:rPr>
+          <w:b/>
+          <w:bCs/>
+        </w:rPr>
+        <w:t xml:space="preserve">The Boost Pool:</w:t>
+      </w:r>
+      <w:r>
+        <w:t xml:space="preserve"> </w:t>
+      </w:r>
+      <w:r>
+        <w:t xml:space="preserve">Pre-negotiate a</w:t>
+      </w:r>
+      <w:r>
+        <w:t xml:space="preserve"> </w:t>
+      </w:r>
+      <w:r>
+        <w:t xml:space="preserve">“Boost Pool”</w:t>
+      </w:r>
+      <w:r>
+        <w:t xml:space="preserve"> </w:t>
+      </w:r>
+      <w:r>
+        <w:t xml:space="preserve">with the episode’s sponsor — a set amount per episode (e.g., $50,000) that can be unlocked incrementally through audience votes. The sponsor commits to the maximum pool amount; the audience determines how much of it is unlocked.</w:t>
+      </w:r>
+    </w:p>
+    <w:p>
+      <w:pPr>
+        <w:pStyle w:val="BodyText"/>
+      </w:pPr>
+      <w:r>
+        <w:rPr>
+          <w:b/>
+          <w:bCs/>
+        </w:rPr>
+        <w:t xml:space="preserve">Vote Cost and Cause:</w:t>
+      </w:r>
+      <w:r>
+        <w:t xml:space="preserve"> </w:t>
+      </w:r>
+      <w:r>
+        <w:t xml:space="preserve">Each vote to boost costs $1, donated to a creator economy scholarship fund rather than to the show directly. This structure avoids gambling regulations while creating genuine financial skin-in-the-game participation. The scholarship fund receives the donation regardless of the vote’s outcome.</w:t>
+      </w:r>
+    </w:p>
+    <w:p>
+      <w:pPr>
+        <w:pStyle w:val="BodyText"/>
+      </w:pPr>
+      <w:r>
+        <w:rPr>
+          <w:b/>
+          <w:bCs/>
+        </w:rPr>
+        <w:t xml:space="preserve">The Progress Bar:</w:t>
+      </w:r>
+      <w:r>
+        <w:t xml:space="preserve"> </w:t>
+      </w:r>
+      <w:r>
+        <w:t xml:space="preserve">Every $2,000 in audience votes unlocks a 10% deal value increase, displayed live on screen with a real-time progress bar. The visual progress bar is the mechanic’s most important design element — audiences need to see their collective action creating visible movement.</w:t>
+      </w:r>
+    </w:p>
+    <w:p>
+      <w:pPr>
+        <w:pStyle w:val="BodyText"/>
+      </w:pPr>
+      <w:r>
+        <w:rPr>
+          <w:b/>
+          <w:bCs/>
+        </w:rPr>
+        <w:t xml:space="preserve">The Cap:</w:t>
+      </w:r>
+      <w:r>
+        <w:t xml:space="preserve"> </w:t>
+      </w:r>
+      <w:r>
+        <w:t xml:space="preserve">Total boost is capped at 100% of the starting deal value — a $5,000 deal can be boosted to a maximum of $10,000. This ensures the sponsor’s pool commitment is never exceeded while creating a clear, achievable target that focuses audience energy.</w:t>
+      </w:r>
+    </w:p>
+    <w:p>
+      <w:pPr>
+        <w:pStyle w:val="BodyText"/>
+      </w:pPr>
+      <w:r>
+        <w:rPr>
+          <w:b/>
+          <w:bCs/>
+        </w:rPr>
+        <w:t xml:space="preserve">Marketing Identity:</w:t>
+      </w:r>
+      <w:r>
+        <w:t xml:space="preserve"> </w:t>
+      </w:r>
+      <w:r>
+        <w:t xml:space="preserve">Position the mechanic as DealStage’s version of a fan power moment:</w:t>
+      </w:r>
+      <w:r>
+        <w:t xml:space="preserve"> </w:t>
+      </w:r>
+      <w:r>
+        <w:t xml:space="preserve">“You decide how much this creator earns.”</w:t>
+      </w:r>
+      <w:r>
+        <w:t xml:space="preserve"> </w:t>
+      </w:r>
+      <w:r>
+        <w:t xml:space="preserve">The contestant knows their performance is being evaluated in real time by an audience that has chosen to invest in their success. The sponsor knows their pool commitment is unlocked only when the audience validates the contestant’s quality. Everyone’s incentives are aligned toward the most compelling possible content.</w:t>
+      </w:r>
+    </w:p>
+    <w:p>
+      <w:pPr>
+        <w:pStyle w:val="BodyText"/>
+      </w:pPr>
+      <w:r>
+        <w:rPr>
+          <w:b/>
+          <w:bCs/>
+        </w:rPr>
+        <w:t xml:space="preserve">Impact Rating:</w:t>
+      </w:r>
+      <w:r>
+        <w:t xml:space="preserve"> </w:t>
+      </w:r>
+      <w:r>
+        <w:t xml:space="preserve">High |</w:t>
+      </w:r>
+      <w:r>
+        <w:t xml:space="preserve"> </w:t>
+      </w:r>
+      <w:r>
+        <w:rPr>
+          <w:b/>
+          <w:bCs/>
+        </w:rPr>
+        <w:t xml:space="preserve">Effort Rating:</w:t>
+      </w:r>
+      <w:r>
+        <w:t xml:space="preserve"> </w:t>
+      </w:r>
+      <w:r>
+        <w:t xml:space="preserve">Medium</w:t>
+      </w:r>
+    </w:p>
+    <w:p>
+      <w:r>
+        <w:pict>
+          <v:rect style="width:0;height:1.5pt" o:hralign="center" o:hrstd="t" o:hr="t"/>
+        </w:pict>
+      </w:r>
+    </w:p>
+    <w:bookmarkEnd w:id="179"/>
+    <w:bookmarkEnd w:id="180"/>
+    <w:bookmarkStart w:id="183" w:name="Xea4b77de6e39e495025677caa9b89e740fb0c92"/>
+    <w:p>
+      <w:pPr>
+        <w:pStyle w:val="Heading2"/>
+      </w:pPr>
+      <w:r>
+        <w:t xml:space="preserve">[NEW] 8.9 — The Devil’s Advocate Panelist: Casting a Genuine Skeptic on Rate My Deal</w:t>
+      </w:r>
+    </w:p>
+    <w:bookmarkStart w:id="181" w:name="concept-overview-8"/>
+    <w:p>
+      <w:pPr>
+        <w:pStyle w:val="Heading3"/>
+      </w:pPr>
+      <w:r>
+        <w:t xml:space="preserve">Concept Overview</w:t>
+      </w:r>
+    </w:p>
+    <w:p>
+      <w:pPr>
+        <w:pStyle w:val="FirstParagraph"/>
+      </w:pPr>
+      <w:r>
+        <w:t xml:space="preserve">Cast one genuinely critical, sometimes abrasive voice on the Rate My Deal panel — someone with a large following who is publicly known for calling out unfair brand deals, refusing sponsored content on principle, or criticizing the creator economy’s compensation structure — to create authentic friction that makes the panel’s verdicts feel earned rather than performed.</w:t>
+      </w:r>
+    </w:p>
+    <w:p>
+      <w:pPr>
+        <w:pStyle w:val="BodyText"/>
+      </w:pPr>
+      <w:r>
+        <w:t xml:space="preserve">Panel shows without dissent are not panels — they are roundtables of agreement. The moment all Rate My Deal panelists reach the same conclusion, the show loses the tension that makes verdicts meaningful. A panelist who pushes back on deals the others celebrate, who asks uncomfortable questions about brand power dynamics, and who occasionally finds a deal so indefensible that their reaction is visceral — that panelist creates the clips that get shared and the verdicts that get argued about.</w:t>
+      </w:r>
+    </w:p>
+    <w:bookmarkEnd w:id="181"/>
+    <w:bookmarkStart w:id="182" w:name="implementation-framework"/>
+    <w:p>
+      <w:pPr>
+        <w:pStyle w:val="Heading3"/>
+      </w:pPr>
+      <w:r>
+        <w:t xml:space="preserve">Implementation Framework</w:t>
+      </w:r>
+    </w:p>
+    <w:p>
+      <w:pPr>
+        <w:pStyle w:val="FirstParagraph"/>
+      </w:pPr>
+      <w:r>
+        <w:rPr>
+          <w:b/>
+          <w:bCs/>
+        </w:rPr>
+        <w:t xml:space="preserve">Candidate Research:</w:t>
+      </w:r>
+      <w:r>
+        <w:t xml:space="preserve"> </w:t>
+      </w:r>
+      <w:r>
+        <w:t xml:space="preserve">Find creators with documented records of publicly declining brand deals or criticizing the creator economy’s pay structure — specifically those who have addressed these topics on YouTube or in podcasts with 100,000+ combined views. The record of public criticism is the credential; the audience size validates the platform.</w:t>
+      </w:r>
+    </w:p>
+    <w:p>
+      <w:pPr>
+        <w:pStyle w:val="BodyText"/>
+      </w:pPr>
+      <w:r>
+        <w:rPr>
+          <w:b/>
+          <w:bCs/>
+        </w:rPr>
+        <w:t xml:space="preserve">The Honest Pitch:</w:t>
+      </w:r>
+      <w:r>
+        <w:t xml:space="preserve"> </w:t>
+      </w:r>
+      <w:r>
+        <w:t xml:space="preserve">Approach candidates explicitly:</w:t>
+      </w:r>
+      <w:r>
+        <w:t xml:space="preserve"> </w:t>
+      </w:r>
+      <w:r>
+        <w:t xml:space="preserve">“We want you on this panel precisely because you disagree with how this industry works. We need that perspective represented. We are not looking for someone who will perform skepticism — we are looking for someone who genuinely has it.”</w:t>
+      </w:r>
+    </w:p>
+    <w:p>
+      <w:pPr>
+        <w:pStyle w:val="BodyText"/>
+      </w:pPr>
+      <w:r>
+        <w:rPr>
+          <w:b/>
+          <w:bCs/>
+        </w:rPr>
+        <w:t xml:space="preserve">Editorial Independence Contract:</w:t>
+      </w:r>
+      <w:r>
+        <w:t xml:space="preserve"> </w:t>
+      </w:r>
+      <w:r>
+        <w:t xml:space="preserve">Structure their contract to guarantee editorial independence. Their disagreements cannot be edited to appear more moderate than they are. Their dissenting verdicts must air in full, not condensed into brief reaction shots. This clause is the casting requirement that distinguishes genuine skeptics from willing participants in a simulated controversy.</w:t>
+      </w:r>
+    </w:p>
+    <w:p>
+      <w:pPr>
+        <w:pStyle w:val="BodyText"/>
+      </w:pPr>
+      <w:r>
+        <w:rPr>
+          <w:b/>
+          <w:bCs/>
+        </w:rPr>
+        <w:t xml:space="preserve">Marketing Identity:</w:t>
+      </w:r>
+      <w:r>
+        <w:t xml:space="preserve"> </w:t>
+      </w:r>
+      <w:r>
+        <w:t xml:space="preserve">Use the panelist’s presence as a show marketing angle:</w:t>
+      </w:r>
+      <w:r>
+        <w:t xml:space="preserve"> </w:t>
+      </w:r>
+      <w:r>
+        <w:t xml:space="preserve">“The panel that includes the person most likely to tell you your deal was terrible.”</w:t>
+      </w:r>
+      <w:r>
+        <w:t xml:space="preserve"> </w:t>
+      </w:r>
+      <w:r>
+        <w:t xml:space="preserve">This attracts creator submissions from people who want an honest verdict rather than validation — which produces better content than submissions seeking approval.</w:t>
+      </w:r>
+    </w:p>
+    <w:p>
+      <w:pPr>
+        <w:pStyle w:val="BodyText"/>
+      </w:pPr>
+      <w:r>
+        <w:rPr>
+          <w:b/>
+          <w:bCs/>
+        </w:rPr>
+        <w:t xml:space="preserve">Season 2 Expansion:</w:t>
+      </w:r>
+      <w:r>
+        <w:t xml:space="preserve"> </w:t>
+      </w:r>
+      <w:r>
+        <w:t xml:space="preserve">If the skeptic character is working in Season 1, give them a dedicated solo segment in Season 2:</w:t>
+      </w:r>
+      <w:r>
+        <w:t xml:space="preserve"> </w:t>
+      </w:r>
+      <w:r>
+        <w:t xml:space="preserve">“The Worst Deal I’ve Ever Seen”</w:t>
+      </w:r>
+      <w:r>
+        <w:t xml:space="preserve"> </w:t>
+      </w:r>
+      <w:r>
+        <w:t xml:space="preserve">— an uninterrupted, unedited reaction to a submitted deal that the panelist finds indefensible. This segment is designed to generate clips.</w:t>
+      </w:r>
+    </w:p>
+    <w:p>
+      <w:pPr>
+        <w:pStyle w:val="BodyText"/>
+      </w:pPr>
+      <w:r>
+        <w:rPr>
+          <w:b/>
+          <w:bCs/>
+        </w:rPr>
+        <w:t xml:space="preserve">Impact Rating:</w:t>
+      </w:r>
+      <w:r>
+        <w:t xml:space="preserve"> </w:t>
+      </w:r>
+      <w:r>
+        <w:t xml:space="preserve">High |</w:t>
+      </w:r>
+      <w:r>
+        <w:t xml:space="preserve"> </w:t>
+      </w:r>
+      <w:r>
+        <w:rPr>
+          <w:b/>
+          <w:bCs/>
+        </w:rPr>
+        <w:t xml:space="preserve">Effort Rating:</w:t>
+      </w:r>
+      <w:r>
+        <w:t xml:space="preserve"> </w:t>
+      </w:r>
+      <w:r>
+        <w:t xml:space="preserve">Low</w:t>
+      </w:r>
+    </w:p>
+    <w:p>
+      <w:r>
+        <w:pict>
+          <v:rect style="width:0;height:1.5pt" o:hralign="center" o:hrstd="t" o:hr="t"/>
+        </w:pict>
+      </w:r>
+    </w:p>
+    <w:bookmarkEnd w:id="182"/>
+    <w:bookmarkEnd w:id="183"/>
+    <w:bookmarkStart w:id="187" w:name="Xf65d05d32e5673822357a472a4bf56b96926ed1"/>
+    <w:p>
+      <w:pPr>
+        <w:pStyle w:val="Heading2"/>
+      </w:pPr>
+      <w:r>
+        <w:t xml:space="preserve">[NEW] 8.10 — The Media Empire Dashboard: A Public Real-Time Analytics Page Showing the Empire’s Combined Impact</w:t>
+      </w:r>
+    </w:p>
+    <w:bookmarkStart w:id="184" w:name="concept-overview-9"/>
+    <w:p>
+      <w:pPr>
+        <w:pStyle w:val="Heading3"/>
+      </w:pPr>
+      <w:r>
+        <w:t xml:space="preserve">Concept Overview</w:t>
+      </w:r>
+    </w:p>
+    <w:p>
+      <w:pPr>
+        <w:pStyle w:val="FirstParagraph"/>
+      </w:pPr>
+      <w:r>
+        <w:t xml:space="preserve">Build and publish a public</w:t>
+      </w:r>
+      <w:r>
+        <w:t xml:space="preserve"> </w:t>
+      </w:r>
+      <w:r>
+        <w:t xml:space="preserve">“DealStage Media Empire Dashboard”</w:t>
+      </w:r>
+      <w:r>
+        <w:t xml:space="preserve"> </w:t>
+      </w:r>
+      <w:r>
+        <w:t xml:space="preserve">— a live analytics page on thedealstage.com showing the combined real-time metrics of all media properties: total viewers across all shows, total platform subscribers, total deals closed through the platform, and total creator earnings facilitated. This page is simultaneously a transparency tool, the company’s most persuasive single marketing asset, and the empirical proof of the empire’s central thesis: that a media layer accelerates platform adoption.</w:t>
+      </w:r>
+    </w:p>
+    <w:bookmarkEnd w:id="184"/>
+    <w:bookmarkStart w:id="185" w:name="the-airbnb-and-doordash-precedents"/>
+    <w:p>
+      <w:pPr>
+        <w:pStyle w:val="Heading3"/>
+      </w:pPr>
+      <w:r>
+        <w:t xml:space="preserve">The Airbnb and DoorDash Precedents</w:t>
+      </w:r>
+    </w:p>
+    <w:p>
+      <w:pPr>
+        <w:pStyle w:val="FirstParagraph"/>
+      </w:pPr>
+      <w:r>
+        <w:t xml:space="preserve">Airbnb built enormous brand equity by publicly celebrating the</w:t>
+      </w:r>
+      <w:r>
+        <w:t xml:space="preserve"> </w:t>
+      </w:r>
+      <w:r>
+        <w:t xml:space="preserve">“Hosts”</w:t>
+      </w:r>
+      <w:r>
+        <w:t xml:space="preserve"> </w:t>
+      </w:r>
+      <w:r>
+        <w:t xml:space="preserve">metric — a running count of how much money hosts had earned. DoorDash shows restaurant partners real-time order data on public-facing dashboards. These public-facing metrics create two categories of value: they demonstrate platform impact in a way that no marketing claim can replicate, and they create a perpetual media hook where every milestone is a press event and every new record is a social media moment.</w:t>
+      </w:r>
+    </w:p>
+    <w:p>
+      <w:pPr>
+        <w:pStyle w:val="BodyText"/>
+      </w:pPr>
+      <w:r>
+        <w:t xml:space="preserve">A DealStage dashboard that shows</w:t>
+      </w:r>
+      <w:r>
+        <w:t xml:space="preserve"> </w:t>
+      </w:r>
+      <w:r>
+        <w:t xml:space="preserve">“$50 million in creator deals facilitated”</w:t>
+      </w:r>
+      <w:r>
+        <w:t xml:space="preserve"> </w:t>
+      </w:r>
+      <w:r>
+        <w:t xml:space="preserve">or</w:t>
+      </w:r>
+      <w:r>
+        <w:t xml:space="preserve"> </w:t>
+      </w:r>
+      <w:r>
+        <w:t xml:space="preserve">“1.2 million weekly viewers across all properties”</w:t>
+      </w:r>
+      <w:r>
+        <w:t xml:space="preserve"> </w:t>
+      </w:r>
+      <w:r>
+        <w:t xml:space="preserve">is not a vanity metric. It is the empirical proof that the media empire’s thesis is working — that the shows and podcasts are driving real platform activity, and that real platform activity is generating real creator earnings.</w:t>
+      </w:r>
+    </w:p>
+    <w:bookmarkEnd w:id="185"/>
+    <w:bookmarkStart w:id="186" w:name="implementation-blueprint-8"/>
+    <w:p>
+      <w:pPr>
+        <w:pStyle w:val="Heading3"/>
+      </w:pPr>
+      <w:r>
+        <w:t xml:space="preserve">Implementation Blueprint</w:t>
+      </w:r>
+    </w:p>
+    <w:p>
+      <w:pPr>
+        <w:pStyle w:val="FirstParagraph"/>
+      </w:pPr>
+      <w:r>
+        <w:rPr>
+          <w:b/>
+          <w:bCs/>
+        </w:rPr>
+        <w:t xml:space="preserve">Metric Selection:</w:t>
+      </w:r>
+      <w:r>
+        <w:t xml:space="preserve"> </w:t>
+      </w:r>
+      <w:r>
+        <w:t xml:space="preserve">Identify five to seven metrics that best represent the empire’s creator impact: (1) total deals facilitated through the platform, (2) average deal size improvement versus the creator’s pre-platform deal history, (3) total creator earnings facilitated, (4) platform subscribers, (5) total weekly media reach across all properties, (6) number of brands actively using the platform, (7) AI match score accuracy rate (updated quarterly based on outcome tracking).</w:t>
+      </w:r>
+    </w:p>
+    <w:p>
+      <w:pPr>
+        <w:pStyle w:val="BodyText"/>
+      </w:pPr>
+      <w:r>
+        <w:rPr>
+          <w:b/>
+          <w:bCs/>
+        </w:rPr>
+        <w:t xml:space="preserve">Dashboard Design:</w:t>
+      </w:r>
+      <w:r>
+        <w:t xml:space="preserve"> </w:t>
+      </w:r>
+      <w:r>
+        <w:t xml:space="preserve">Build the dashboard as a public page on thedealstage.com with a design optimized for sharing rather than just reading. Every metric has a</w:t>
+      </w:r>
+      <w:r>
+        <w:t xml:space="preserve"> </w:t>
+      </w:r>
+      <w:r>
+        <w:t xml:space="preserve">“Share this milestone”</w:t>
+      </w:r>
+      <w:r>
+        <w:t xml:space="preserve"> </w:t>
+      </w:r>
+      <w:r>
+        <w:t xml:space="preserve">button that generates a pre-formatted social post. The page is updated in real time where feasible (subscriber counts, weekly media reach) and weekly where real-time is impractical (deal values, earnings data).</w:t>
+      </w:r>
+    </w:p>
+    <w:p>
+      <w:pPr>
+        <w:pStyle w:val="BodyText"/>
+      </w:pPr>
+      <w:r>
+        <w:rPr>
+          <w:b/>
+          <w:bCs/>
+        </w:rPr>
+        <w:t xml:space="preserve">Automated Milestone Alerts:</w:t>
+      </w:r>
+      <w:r>
+        <w:t xml:space="preserve"> </w:t>
+      </w:r>
+      <w:r>
+        <w:t xml:space="preserve">When the platform crosses pre-defined milestones — $10M in creator deals facilitated, 1M weekly viewers, 10,000 platform subscribers — a press release is automatically prepared and social channels announce it. Milestone marketing requires no editorial judgment when the infrastructure is built in advance.</w:t>
+      </w:r>
+    </w:p>
+    <w:p>
+      <w:pPr>
+        <w:pStyle w:val="BodyText"/>
+      </w:pPr>
+      <w:r>
+        <w:rPr>
+          <w:b/>
+          <w:bCs/>
+        </w:rPr>
+        <w:t xml:space="preserve">Universal Pitch Integration:</w:t>
+      </w:r>
+      <w:r>
+        <w:t xml:space="preserve"> </w:t>
+      </w:r>
+      <w:r>
+        <w:t xml:space="preserve">Feature the dashboard as the opening page of every pitch — TV show, investor, brand partnership, and agency recruitment. Replace every claim about the platform’s impact with a number from the dashboard.</w:t>
+      </w:r>
+      <w:r>
+        <w:t xml:space="preserve"> </w:t>
+      </w:r>
+      <w:r>
+        <w:t xml:space="preserve">“We drive platform adoption”</w:t>
+      </w:r>
+      <w:r>
+        <w:t xml:space="preserve"> </w:t>
+      </w:r>
+      <w:r>
+        <w:t xml:space="preserve">becomes</w:t>
+      </w:r>
+      <w:r>
+        <w:t xml:space="preserve"> </w:t>
+      </w:r>
+      <w:r>
+        <w:t xml:space="preserve">“We facilitated $47M in creator deals last year, documented on our public dashboard.”</w:t>
+      </w:r>
+    </w:p>
+    <w:p>
+      <w:pPr>
+        <w:pStyle w:val="BodyText"/>
+      </w:pPr>
+      <w:r>
+        <w:rPr>
+          <w:b/>
+          <w:bCs/>
+        </w:rPr>
+        <w:t xml:space="preserve">The Proof of Thesis:</w:t>
+      </w:r>
+      <w:r>
+        <w:t xml:space="preserve"> </w:t>
+      </w:r>
+      <w:r>
+        <w:t xml:space="preserve">The dashboard is the single document that answers the question every investor, network executive, and brand partner eventually asks:</w:t>
+      </w:r>
+      <w:r>
+        <w:t xml:space="preserve"> </w:t>
+      </w:r>
+      <w:r>
+        <w:t xml:space="preserve">“Is this actually working for creators?”</w:t>
+      </w:r>
+      <w:r>
+        <w:t xml:space="preserve"> </w:t>
+      </w:r>
+      <w:r>
+        <w:t xml:space="preserve">The answer is a URL with a live counter.</w:t>
+      </w:r>
+    </w:p>
+    <w:p>
+      <w:pPr>
+        <w:pStyle w:val="BodyText"/>
+      </w:pPr>
+      <w:r>
+        <w:rPr>
+          <w:b/>
+          <w:bCs/>
+        </w:rPr>
+        <w:t xml:space="preserve">Impact Rating:</w:t>
+      </w:r>
+      <w:r>
+        <w:t xml:space="preserve"> </w:t>
+      </w:r>
+      <w:r>
+        <w:t xml:space="preserve">High |</w:t>
+      </w:r>
+      <w:r>
+        <w:t xml:space="preserve"> </w:t>
+      </w:r>
+      <w:r>
+        <w:rPr>
+          <w:b/>
+          <w:bCs/>
+        </w:rPr>
+        <w:t xml:space="preserve">Effort Rating:</w:t>
+      </w:r>
+      <w:r>
+        <w:t xml:space="preserve"> </w:t>
+      </w:r>
+      <w:r>
+        <w:t xml:space="preserve">Medium</w:t>
+      </w:r>
+    </w:p>
+    <w:p>
+      <w:r>
+        <w:pict>
+          <v:rect style="width:0;height:1.5pt" o:hralign="center" o:hrstd="t" o:hr="t"/>
+        </w:pict>
+      </w:r>
+    </w:p>
+    <w:p>
+      <w:pPr>
+        <w:pStyle w:val="FirstParagraph"/>
+      </w:pPr>
+      <w:r>
+        <w:rPr>
+          <w:i/>
+          <w:iCs/>
+        </w:rPr>
+        <w:t xml:space="preserve">Strategic enhancements section completed: March 20, 2026</w:t>
+      </w:r>
+      <w:r>
+        <w:t xml:space="preserve"> </w:t>
+      </w:r>
+      <w:r>
+        <w:rPr>
+          <w:i/>
+          <w:iCs/>
+        </w:rPr>
+        <w:t xml:space="preserve">Source: STRATEGIC_SUGGESTIONS_DOCS_5_8.md — All 10 suggestions for Document 8 applied in full.</w:t>
+      </w:r>
+      <w:r>
+        <w:t xml:space="preserve"> </w:t>
+      </w:r>
+      <w:r>
+        <w:rPr>
+          <w:i/>
+          <w:iCs/>
+        </w:rPr>
+        <w:t xml:space="preserve">Three prior documents reviewed and updated in this audit: PART2_TV_SHOW_COMPLETE.md (Grade B+), PART2_TV_SHOW_ADDITIONAL_CONCEPTS.md (Grade A-), PART3_4_5_VIRAL_PODCAST_THESIS_COMPLETE.md (Grade A-)</w:t>
+      </w:r>
+    </w:p>
+    <w:bookmarkEnd w:id="186"/>
+    <w:bookmarkEnd w:id="187"/>
+    <w:bookmarkEnd w:id="188"/>
     <w:sectPr>
       <w:footnotePr>
         <w:numRestart w:val="eachSect"/>

</xml_diff>